<commit_message>
Integrate Ollama Qwen2.5 for dynamic AI policy generation and update RAG index with 909 chunks
</commit_message>
<xml_diff>
--- a/india_monitor_data/rag/documents/Strike_Intelligence/Bhubaneswar_Strike_Intelligence.docx
+++ b/india_monitor_data/rag/documents/Strike_Intelligence/Bhubaneswar_Strike_Intelligence.docx
@@ -13,7 +13,7 @@
     </w:p>
     <w:p>
       <w:r>
-        <w:t>Report Generated: 2026-08-31 20:08:19</w:t>
+        <w:t>Report Generated: 2026-08-31 20:24:15</w:t>
       </w:r>
     </w:p>
     <w:p>
@@ -37,6 +37,22 @@
     <w:p>
       <w:r>
         <w:t>This intelligence brief evaluates active and historical transportation strikes, roadway blockades, and labor disruptions impacting freight transit in the Bhubaneswar commercial logistics corridor. Of the 3 analyzed disruption records, 0 are classified as HIGH severity (e.g., indefinite strikes, complete bandhs) and 0 as MEDIUM severity. Dominant disruption modalities: Taxi (2), Bus (1).</w:t>
+      </w:r>
+    </w:p>
+    <w:p>
+      <w:pPr>
+        <w:pStyle w:val="Heading2"/>
+      </w:pPr>
+      <w:r>
+        <w:t>1.1 AI Strategic Risk Assessment (Qwen2.5 Synthesized)</w:t>
+      </w:r>
+    </w:p>
+    <w:p>
+      <w:r>
+        <w:t>Given the recent transportation strikes and protests in Bhubaneswar, India, the risk level for freight logistics operations is currently high. The incidents of violence, including stone-throwing and vandalism, indicate a volatile environment that could disrupt normal operations. Key bottleneck risks include potential road closures, delays, and increased security costs. These events pose significant challenges for dispatch planners, who must navigate an unpredictable and potentially dangerous landscape.</w:t>
+        <w:br/>
+        <w:br/>
+        <w:t>To mitigate these risks, dispatch planners should implement a multi-faceted strategy. First, diversify routes and transportation modes to avoid areas of conflict. Real-time traffic and incident updates should be integrated into routing software to dynamically adjust delivery plans. Second, establish contingency plans for rerouting and alternative suppliers or carriers. Third, engage with local law enforcement and transportation authorities to gain insights and support. Finally, ensure all drivers are equipped with safety gear and are trained in emergency procedures. By proactively addressing these risks, logistics operations can minimize disruptions and maintain service levels during periods of unrest.</w:t>
       </w:r>
     </w:p>
     <w:p>

</xml_diff>

<commit_message>
Implement Hybrid Rule + AI structured insight documents with discrete rule IDs and logistics corridor tables
</commit_message>
<xml_diff>
--- a/india_monitor_data/rag/documents/Strike_Intelligence/Bhubaneswar_Strike_Intelligence.docx
+++ b/india_monitor_data/rag/documents/Strike_Intelligence/Bhubaneswar_Strike_Intelligence.docx
@@ -8,22 +8,16 @@
         <w:jc w:val="center"/>
       </w:pPr>
       <w:r>
-        <w:t>Bhubaneswar Transportation Disruption Intelligence &amp; Routing Protocol</w:t>
+        <w:t>BHUBANESWAR TRANSPORTATION DISRUPTION INTELLIGENCE &amp; ROUTING PLAYBOOK</w:t>
       </w:r>
     </w:p>
     <w:p>
       <w:r>
-        <w:t>Report Generated: 2026-08-31 20:24:15</w:t>
-      </w:r>
-    </w:p>
-    <w:p>
-      <w:r>
-        <w:t>Monitored Geographic Hub: Bhubaneswar Logistics Cluster</w:t>
-      </w:r>
-    </w:p>
-    <w:p>
-      <w:r>
-        <w:t>Total Disruption Events Analyzed: 3</w:t>
+        <w:t>Monitored Freight Hub: Bhubaneswar Logistics Cluster</w:t>
+        <w:br/>
+        <w:t>Generated: 2026-08-31 20:57:24 | Total Disruption Incidents Analyzed: 3</w:t>
+        <w:br/>
+        <w:t>Disruption Severity Breakdown: 🔴 HIGH: 0 | 🟡 MEDIUM: 0 | 🟢 LOW: 3</w:t>
       </w:r>
     </w:p>
     <w:p>
@@ -31,28 +25,251 @@
         <w:pStyle w:val="Heading1"/>
       </w:pPr>
       <w:r>
-        <w:t>1. Executive Regional Disruption Assessment</w:t>
+        <w:t>1. EXTRACTED DISRUPTION INCIDENT REGISTRY</w:t>
+      </w:r>
+    </w:p>
+    <w:tbl>
+      <w:tblPr>
+        <w:tblStyle w:val="TableGrid"/>
+        <w:tblW w:type="auto" w:w="0"/>
+        <w:tblLook w:firstColumn="1" w:firstRow="1" w:lastColumn="0" w:lastRow="0" w:noHBand="0" w:noVBand="1" w:val="04A0"/>
+      </w:tblPr>
+      <w:tblGrid>
+        <w:gridCol w:w="1728"/>
+        <w:gridCol w:w="1728"/>
+        <w:gridCol w:w="1728"/>
+        <w:gridCol w:w="1728"/>
+        <w:gridCol w:w="1728"/>
+      </w:tblGrid>
+      <w:tr>
+        <w:tc>
+          <w:tcPr>
+            <w:tcW w:type="dxa" w:w="1728"/>
+          </w:tcPr>
+          <w:p>
+            <w:r>
+              <w:t>Incident ID &amp; Date</w:t>
+            </w:r>
+          </w:p>
+        </w:tc>
+        <w:tc>
+          <w:tcPr>
+            <w:tcW w:type="dxa" w:w="1728"/>
+          </w:tcPr>
+          <w:p>
+            <w:r>
+              <w:t>Source</w:t>
+            </w:r>
+          </w:p>
+        </w:tc>
+        <w:tc>
+          <w:tcPr>
+            <w:tcW w:type="dxa" w:w="1728"/>
+          </w:tcPr>
+          <w:p>
+            <w:r>
+              <w:t>Disruption Modality</w:t>
+            </w:r>
+          </w:p>
+        </w:tc>
+        <w:tc>
+          <w:tcPr>
+            <w:tcW w:type="dxa" w:w="1728"/>
+          </w:tcPr>
+          <w:p>
+            <w:r>
+              <w:t>Stated Trigger / Demand</w:t>
+            </w:r>
+          </w:p>
+        </w:tc>
+        <w:tc>
+          <w:tcPr>
+            <w:tcW w:type="dxa" w:w="1728"/>
+          </w:tcPr>
+          <w:p>
+            <w:r>
+              <w:t>Freight Impact Severity</w:t>
+            </w:r>
+          </w:p>
+        </w:tc>
+      </w:tr>
+      <w:tr>
+        <w:tc>
+          <w:tcPr>
+            <w:tcW w:type="dxa" w:w="1728"/>
+          </w:tcPr>
+          <w:p>
+            <w:r>
+              <w:t>INC-BHU-01</w:t>
+              <w:br/>
+              <w:t>(2026-08-20)</w:t>
+            </w:r>
+          </w:p>
+        </w:tc>
+        <w:tc>
+          <w:tcPr>
+            <w:tcW w:type="dxa" w:w="1728"/>
+          </w:tcPr>
+          <w:p>
+            <w:r>
+              <w:t>NDTV</w:t>
+            </w:r>
+          </w:p>
+        </w:tc>
+        <w:tc>
+          <w:tcPr>
+            <w:tcW w:type="dxa" w:w="1728"/>
+          </w:tcPr>
+          <w:p>
+            <w:r>
+              <w:t>Taxi</w:t>
+            </w:r>
+          </w:p>
+        </w:tc>
+        <w:tc>
+          <w:tcPr>
+            <w:tcW w:type="dxa" w:w="1728"/>
+          </w:tcPr>
+          <w:p>
+            <w:r>
+              <w:t>Bhubaneswar Taxi Drivers Protest: 80 Arrested, 13 Cops Injured In Violence</w:t>
+            </w:r>
+          </w:p>
+        </w:tc>
+        <w:tc>
+          <w:tcPr>
+            <w:tcW w:type="dxa" w:w="1728"/>
+          </w:tcPr>
+          <w:p>
+            <w:r>
+              <w:t>🟢 LOW</w:t>
+            </w:r>
+          </w:p>
+        </w:tc>
+      </w:tr>
+      <w:tr>
+        <w:tc>
+          <w:tcPr>
+            <w:tcW w:type="dxa" w:w="1728"/>
+          </w:tcPr>
+          <w:p>
+            <w:r>
+              <w:t>INC-BHU-02</w:t>
+              <w:br/>
+              <w:t>(2026-08-19)</w:t>
+            </w:r>
+          </w:p>
+        </w:tc>
+        <w:tc>
+          <w:tcPr>
+            <w:tcW w:type="dxa" w:w="1728"/>
+          </w:tcPr>
+          <w:p>
+            <w:r>
+              <w:t>Outlook India</w:t>
+            </w:r>
+          </w:p>
+        </w:tc>
+        <w:tc>
+          <w:tcPr>
+            <w:tcW w:type="dxa" w:w="1728"/>
+          </w:tcPr>
+          <w:p>
+            <w:r>
+              <w:t>Taxi</w:t>
+            </w:r>
+          </w:p>
+        </w:tc>
+        <w:tc>
+          <w:tcPr>
+            <w:tcW w:type="dxa" w:w="1728"/>
+          </w:tcPr>
+          <w:p>
+            <w:r>
+              <w:t>Bhubaneswar Cab Drivers’ Protest Turns Violent, Over 30 Detained</w:t>
+            </w:r>
+          </w:p>
+        </w:tc>
+        <w:tc>
+          <w:tcPr>
+            <w:tcW w:type="dxa" w:w="1728"/>
+          </w:tcPr>
+          <w:p>
+            <w:r>
+              <w:t>🟢 LOW</w:t>
+            </w:r>
+          </w:p>
+        </w:tc>
+      </w:tr>
+      <w:tr>
+        <w:tc>
+          <w:tcPr>
+            <w:tcW w:type="dxa" w:w="1728"/>
+          </w:tcPr>
+          <w:p>
+            <w:r>
+              <w:t>INC-BHU-03</w:t>
+              <w:br/>
+              <w:t>(2026-08-19)</w:t>
+            </w:r>
+          </w:p>
+        </w:tc>
+        <w:tc>
+          <w:tcPr>
+            <w:tcW w:type="dxa" w:w="1728"/>
+          </w:tcPr>
+          <w:p>
+            <w:r>
+              <w:t>The Times of India</w:t>
+            </w:r>
+          </w:p>
+        </w:tc>
+        <w:tc>
+          <w:tcPr>
+            <w:tcW w:type="dxa" w:w="1728"/>
+          </w:tcPr>
+          <w:p>
+            <w:r>
+              <w:t>Bus</w:t>
+            </w:r>
+          </w:p>
+        </w:tc>
+        <w:tc>
+          <w:tcPr>
+            <w:tcW w:type="dxa" w:w="1728"/>
+          </w:tcPr>
+          <w:p>
+            <w:r>
+              <w:t>Protesters hurl stones at police, vandalise buses as app cab, bike strike turns violent in</w:t>
+            </w:r>
+          </w:p>
+        </w:tc>
+        <w:tc>
+          <w:tcPr>
+            <w:tcW w:type="dxa" w:w="1728"/>
+          </w:tcPr>
+          <w:p>
+            <w:r>
+              <w:t>🟢 LOW</w:t>
+            </w:r>
+          </w:p>
+        </w:tc>
+      </w:tr>
+    </w:tbl>
+    <w:p/>
+    <w:p>
+      <w:pPr>
+        <w:pStyle w:val="Heading1"/>
+      </w:pPr>
+      <w:r>
+        <w:t>2. CRITICAL BOTTLENECKS &amp; HIGHWAY BYPASS DIRECTIVES</w:t>
       </w:r>
     </w:p>
     <w:p>
       <w:r>
-        <w:t>This intelligence brief evaluates active and historical transportation strikes, roadway blockades, and labor disruptions impacting freight transit in the Bhubaneswar commercial logistics corridor. Of the 3 analyzed disruption records, 0 are classified as HIGH severity (e.g., indefinite strikes, complete bandhs) and 0 as MEDIUM severity. Dominant disruption modalities: Taxi (2), Bus (1).</w:t>
-      </w:r>
-    </w:p>
-    <w:p>
-      <w:pPr>
-        <w:pStyle w:val="Heading2"/>
-      </w:pPr>
-      <w:r>
-        <w:t>1.1 AI Strategic Risk Assessment (Qwen2.5 Synthesized)</w:t>
-      </w:r>
-    </w:p>
-    <w:p>
-      <w:r>
-        <w:t>Given the recent transportation strikes and protests in Bhubaneswar, India, the risk level for freight logistics operations is currently high. The incidents of violence, including stone-throwing and vandalism, indicate a volatile environment that could disrupt normal operations. Key bottleneck risks include potential road closures, delays, and increased security costs. These events pose significant challenges for dispatch planners, who must navigate an unpredictable and potentially dangerous landscape.</w:t>
+        <w:t>• Primary Choke Points: Bhubaneswar primary national highway arterial entry gates and regional transshipment yards.</w:t>
         <w:br/>
-        <w:br/>
-        <w:t>To mitigate these risks, dispatch planners should implement a multi-faceted strategy. First, diversify routes and transportation modes to avoid areas of conflict. Real-time traffic and incident updates should be integrated into routing software to dynamically adjust delivery plans. Second, establish contingency plans for rerouting and alternative suppliers or carriers. Third, engage with local law enforcement and transportation authorities to gain insights and support. Finally, ensure all drivers are equipped with safety gear and are trained in emergency procedures. By proactively addressing these risks, logistics operations can minimize disruptions and maintain service levels during periods of unrest.</w:t>
+        <w:t>• Recommended FTL Bypass: Reroute freight via state highway ring corridors; enforce night dispatch schedules.</w:t>
       </w:r>
     </w:p>
     <w:p>
@@ -60,17 +277,35 @@
         <w:pStyle w:val="Heading1"/>
       </w:pPr>
       <w:r>
-        <w:t>2. Critical Corridors &amp; Choke Points</w:t>
+        <w:t>3. AUTONOMOUS COPILOT ADJUDICATION &amp; LEGAL RULES</w:t>
       </w:r>
     </w:p>
     <w:p>
       <w:r>
-        <w:t>Primary Inbound/Outbound Transit Routes: Bhubaneswar primary national highway entry points and regional transshipment yards.</w:t>
+        <w:t>[RULE-S-BHU-01] FORCE MAJEURE &amp; SLA PENALTY WAIVER (SECTION 8.4):</w:t>
+        <w:br/>
+        <w:t xml:space="preserve">  Government-declared bandhs or verified labor road blockades &gt;12h in Bhubaneswar grant 100% carrier SLA delay penalty waiver ($500/day -&gt; $0.00) upon submission of GPS telematics or police traffic advisory.</w:t>
       </w:r>
     </w:p>
     <w:p>
       <w:r>
-        <w:t>Impact Profile: Labor strikes and bandhs in this cluster directly impede primary FTL linehauls and disrupt secondary final-mile dispatch to veterinary clinics and regional animal hospitals.</w:t>
+        <w:t>[RULE-S-BHU-02] EMERGENCY AIR FREIGHT &amp; MODE SHIFT (CLAUSE 2.3):</w:t>
+        <w:br/>
+        <w:t xml:space="preserve">  For life-critical veterinary diets and urgent pharmaceuticals (sap_mara.specialty_diet_flag = 1) stranded &gt;24h in Bhubaneswar, authorize immediate $1,000 Air Freight replacement per Medical Stock-Out Policy 2024-04.</w:t>
+      </w:r>
+    </w:p>
+    <w:p>
+      <w:r>
+        <w:t>[RULE-S-BHU-03] TRUCK DETENTION &amp; DEMURRAGE LIABILITY CAP:</w:t>
+        <w:br/>
+        <w:t xml:space="preserve">  Carrier demurrage and truck detention claims during labor strikes are strictly capped at $100.00/day per vehicle, requiring verified GPS geofence timestamps.</w:t>
+      </w:r>
+    </w:p>
+    <w:p>
+      <w:r>
+        <w:t>[RULE-S-BHU-04] DYNAMIC TRANSIT BUFFER &amp; CLINIC RESCHEDULING:</w:t>
+        <w:br/>
+        <w:t xml:space="preserve">  Automatically inject a +12.0h to +24.0h dynamic safety buffer into predicted arrival time (PDD). If delay pushes arrival past clinic closing time (17:00), reschedule to 09:00 next business morning and trigger carrier redelivery fee waiver ($150 cap).</w:t>
       </w:r>
     </w:p>
     <w:p>
@@ -78,96 +313,27 @@
         <w:pStyle w:val="Heading1"/>
       </w:pPr>
       <w:r>
-        <w:t>3. Chronological Disruption Incidents &amp; Intelligence Registry</w:t>
+        <w:t>4. COPILOT DETERMINISTIC ACTION CHECKLIST</w:t>
       </w:r>
     </w:p>
     <w:p>
       <w:r>
-        <w:rPr>
-          <w:b/>
-        </w:rPr>
-        <w:t>Incident #1: Bhubaneswar Taxi Drivers Protest: 80 Arrested, 13 Cops Injured In Violence - NDTV</w:t>
-        <w:br/>
-      </w:r>
-      <w:r>
-        <w:t>• Published Date: 2026-08-20 | Source: NDTV</w:t>
-        <w:br/>
-      </w:r>
-      <w:r>
-        <w:t>• Modality: Taxi | Severity: LOW</w:t>
-        <w:br/>
+        <w:t>[x] Step 1: Scan active SAP linehauls (sap_vttk) scheduled to pass through Bhubaneswar disruption zone.</w:t>
       </w:r>
     </w:p>
     <w:p>
       <w:r>
-        <w:rPr>
-          <w:b/>
-        </w:rPr>
-        <w:t>Incident #2: Bhubaneswar Cab Drivers’ Protest Turns Violent, Over 30 Detained - Outlook India</w:t>
-        <w:br/>
-      </w:r>
-      <w:r>
-        <w:t>• Published Date: 2026-08-19 | Source: Outlook India</w:t>
-        <w:br/>
-      </w:r>
-      <w:r>
-        <w:t>• Modality: Taxi | Severity: LOW</w:t>
-        <w:br/>
+        <w:t>[x] Step 2: Calculate revised ETA with [RULE-S-BHU-04] dynamic buffer (+12h to +24h).</w:t>
       </w:r>
     </w:p>
     <w:p>
       <w:r>
-        <w:rPr>
-          <w:b/>
-        </w:rPr>
-        <w:t>Incident #3: Protesters hurl stones at police, vandalise buses as app cab, bike strike turns violent in Bhubaneswar - The Times of India</w:t>
-        <w:br/>
-      </w:r>
-      <w:r>
-        <w:t>• Published Date: 2026-08-19 | Source: The Times of India</w:t>
-        <w:br/>
-      </w:r>
-      <w:r>
-        <w:t>• Modality: Bus | Severity: LOW</w:t>
-        <w:br/>
-      </w:r>
-    </w:p>
-    <w:p>
-      <w:pPr>
-        <w:pStyle w:val="Heading1"/>
-      </w:pPr>
-      <w:r>
-        <w:t>4. Autonomous Copilot Operational &amp; Legal Rules</w:t>
+        <w:t>[x] Step 3: If delay &gt;24h for specialty diets, trigger [RULE-S-BHU-02] $1,000 Air Freight replacement.</w:t>
       </w:r>
     </w:p>
     <w:p>
       <w:r>
-        <w:t>When active transit strikes or civil disruptions are detected in Bhubaneswar, the O2C Copilot applies the following deterministic decision rules:</w:t>
-      </w:r>
-    </w:p>
-    <w:p>
-      <w:r>
-        <w:t>• Force Majeure Adjudication (Clause 8.4): If a government-sanctioned bandh or total union road blockade in Bhubaneswar delays transit by &gt;12 hours, the carrier delay SLA penalty ($500/day) is waived upon submission of verified e-way bill telematics or police traffic advisory.</w:t>
-      </w:r>
-    </w:p>
-    <w:p>
-      <w:r>
-        <w:t>• Dynamic Transit Buffer: For any order scheduled to pass through Bhubaneswar with active strike news, automatically inject a +12.0 to +24.0 hour safety buffer into the predicted ETA.</w:t>
-      </w:r>
-    </w:p>
-    <w:p>
-      <w:r>
-        <w:t>• Mode Shift Escalation: For life-critical veterinary diets and urgent pharmaceuticals routed through Bhubaneswar with strike duration &gt;24h, authorize emergency intermodal rail shift or $1,000 Air Freight replacement per Medical Stock-Out Policy 2024-04.</w:t>
-      </w:r>
-    </w:p>
-    <w:p>
-      <w:r>
-        <w:t>• Receiving Window Compliance: If transit delays push delivery past clinic receiving hours (after 17:00), automatically reschedule delivery to 09:00 next business morning and trigger carrier redelivery fee waiver ($150 cap).</w:t>
-      </w:r>
-    </w:p>
-    <w:p>
-      <w:r>
-        <w:t>• Proactive Stakeholder Notification: Send automated Microsoft Teams escalation card to Regional Logistics Director when order financial risk exceeds $500 threshold.</w:t>
+        <w:t>[x] Step 4: Dispatch automated Actionable Adaptive Card to Regional Logistics Director for financial risk &gt;$500.</w:t>
       </w:r>
     </w:p>
     <w:sectPr>

</xml_diff>